<commit_message>
Correct OC framing: brick is OC22 un-shocked (not flat OC20), contestable
User sanity-check: OC is the SUM of every model's OC in the unit; base
Terminator is OC1, so a 10-Terminator + Lysander unit is ~OC11-12 raw.

My "OC20" came from Lysander's Inspiring Commander, whose exact text is
"non-Character models in Terminator Assault Squad and Terminator Squad units
have an Objective Control characteristic of 2 WHILE THEY ARE NOT BATTLE-SHOCKED."
So: 10 Terminators OC2 = 20, +Lysander +Ancient (Characters, OC1) = OC22 while
un-shocked, dropping to OC12 if Battle-shocked. Two fixes:
 - I'd dropped the "while not Battle-shocked" condition (it's a switch).
 - I over-weighted it in the sim as an uncontestable auto-hold; it's beatable
   by piling ~OC23+ nearby or by Battle-shocking the brick down to OC12.

Patched tools/gen_greatvalue_sim_docx.py (+ regenerated the docx) and MEMORY.md.

Co-Authored-By: Claude Opus 4.8 (1M context) <noreply@anthropic.com>
</commit_message>
<xml_diff>
--- a/docs/Great-Value-vs-Knights-Full-Game-Simulation.docx
+++ b/docs/Great-Value-vs-Knights-Full-Game-Simulation.docx
@@ -211,7 +211,7 @@
               <w:rPr>
                 <w:sz w:val="18"/>
               </w:rPr>
-              <w:t>Icon of Obstinacy (−1 to wound the unit when S≥T5), Rampart (2+ inv once), Inspiring Commander (his Terminators are OC2 → brick is OC20), Champion of the Feast (+1 A), Terminatus Assault (Battle-shock on engage). Wrath of Dorn: FULL wound re-roll vs Oath target.</w:t>
+              <w:t>Icon of Obstinacy (−1 to wound the unit when S≥T5), Rampart (2+ inv once), Inspiring Commander (non-Character Terminators are OC2 WHILE NOT BATTLE-SHOCKED → brick OC22; base OC12, and a Battle-shock drops it back to OC12), Champion of the Feast (+1 A), Terminatus Assault (Battle-shock on engage). Wrath of Dorn: FULL wound re-roll vs Oath target.</w:t>
             </w:r>
           </w:p>
         </w:tc>
@@ -343,7 +343,7 @@
               <w:rPr>
                 <w:sz w:val="18"/>
               </w:rPr>
-              <w:t>PSYKER unit. Fusillade (Lethal Hits; +Sustained under Pyromancy). Fury of the First (+1 Hit vs Oath, datasheet). OC20. The real ranged Knight-threat — but slow (M5).</w:t>
+              <w:t>PSYKER unit. Fusillade (Lethal Hits; +Sustained under Pyromancy). Fury of the First (+1 Hit vs Oath, datasheet). OC22 un-shocked (Inspiring Commander), OC12 base. The real ranged Knight-threat — but slow (M5).</w:t>
             </w:r>
           </w:p>
         </w:tc>
@@ -1973,7 +1973,7 @@
         <w:rPr>
           <w:sz w:val="20"/>
         </w:rPr>
-        <w:t>Destroyed 1 unit (the Warglaive) → 3 VP. Round-2+ objective clauses: does he control a non-home objective? His brick is near C but my Immolator (OC3) + presence still contest — and his OC20 brick, IF it’s within range of C, would take it. Ruling it his: he controls C → 4 VP; but he does NOT control MORE objectives than me (I hold D + E-adjacent + my home; he has C + his home) → no 6 VP. ‘Destroyed more than I lost last turn’ (I lost 0 last turn) → 4 VP. Secondary: Bring It Down (killed a Warglaive = Vehicle) → 4 VP.</w:t>
+        <w:t>Destroyed 1 unit (the Warglaive) → 3 VP. Round-2+ objective clauses: does he control a non-home objective? His brick is near C but my Immolator (OC3) + presence still contest — and his OC22 brick, IF it’s within range of C, would take it. Ruling it his: he controls C → 4 VP; but he does NOT control MORE objectives than me (I hold D + E-adjacent + my home; he has C + his home) → no 6 VP. ‘Destroyed more than I lost last turn’ (I lost 0 last turn) → 4 VP. Secondary: Bring It Down (killed a Warglaive = Vehicle) → 4 VP.</w:t>
       </w:r>
     </w:p>
     <w:p>
@@ -2234,7 +2234,7 @@
         <w:rPr>
           <w:sz w:val="20"/>
         </w:rPr>
-        <w:t>The TH/SS brick pivots to SQUAT the centre C (OC20 — nothing I own out-controls it there). Bladeguard remnant + Ancient shuffle to contest D. The surviving Vanguard chase objectives. He uses Dropship Extraction? No — no upside now; he needs bodies ON objectives, not in reserve.</w:t>
+        <w:t>The TH/SS brick pivots to SQUAT the centre C (OC22 un-shocked — to out-control it I must pile ~OC23+ nearby, e.g. two OC10 Knights + an Armiger, OR Battle-shock it down to OC12). Bladeguard remnant + Ancient shuffle to contest D. The surviving Vanguard chase objectives. He uses Dropship Extraction? No — no upside now; he needs bodies ON objectives, not in reserve.</w:t>
       </w:r>
     </w:p>
     <w:p>
@@ -2310,7 +2310,7 @@
         <w:rPr>
           <w:sz w:val="20"/>
         </w:rPr>
-        <w:t>Destroyed 0 of my units this turn → 0 on that clause. Objectives: he controls C (brick OC20) + his home A + contests D → he may control MORE objectives than me this snapshot → 6 VP + 4 VP (non-home C) = 10 VP. ‘Destroyed more than I lost’ (I lost 0) → 0. Secondary: Cleanse → 3 VP. This is his big primary turn — the OC20 brick squatting the centre is real.</w:t>
+        <w:t>Destroyed 0 of my units this turn → 0 on that clause. Objectives: he controls C (brick OC22) + his home A + contests D → he may control MORE objectives than me this snapshot → 6 VP + 4 VP (non-home C) = 10 VP. ‘Destroyed more than I lost’ (I lost 0) → 0. Secondary: Cleanse → 3 VP. This is his big primary turn — the OC22 brick squatting the centre is real.</w:t>
       </w:r>
     </w:p>
     <w:p>
@@ -2346,7 +2346,7 @@
           <w:color w:val="555555"/>
           <w:sz w:val="18"/>
         </w:rPr>
-        <w:t xml:space="preserve">   He surges on the objective-control clause — the OC20 brick on the centre is his one genuine board-control tool. I MUST break the ‘more objectives than me’ math next turn.</w:t>
+        <w:t xml:space="preserve">   He surges on the objective-control clause — the OC22 brick on the centre is his one genuine board-control tool. I MUST break the ‘more objectives than me’ math next turn.</w:t>
       </w:r>
     </w:p>
     <w:p>
@@ -3133,7 +3133,7 @@
           <w:i w:val="0"/>
           <w:sz w:val="18"/>
         </w:rPr>
-        <w:t xml:space="preserve">   Priority Assets / Vital Link let my speed + OC10 win the board while his two OC20 bricks could only squat one objective each. I conceded the centre and won B + D + E + his home instead — and denied his 6-VP ‘more-objectives’ swing in rounds 4–5.</w:t>
+        <w:t xml:space="preserve">   Priority Assets / Vital Link let my speed + OC10 win the board while his two OC22 bricks could only squat one objective each. I conceded the centre and won B + D + E + his home instead — and denied his 6-VP ‘more-objectives’ swing in rounds 4–5.</w:t>
       </w:r>
     </w:p>
     <w:p>
@@ -3208,7 +3208,7 @@
         <w:spacing w:after="40"/>
       </w:pPr>
       <w:r>
-        <w:t>His OC20 Terminators are better board-control than ‘everything’s OC1’ implied. If both bricks reach objectives, the objective count tightens — speed and killing his soft scorers (Intercessors, Vanguard) is what keeps me ahead on the count.</w:t>
+        <w:t>His OC22 Terminators are better board-control than ‘everything’s OC1’ implied. If both bricks reach objectives, the objective count tightens — speed and killing his soft scorers (Intercessors, Vanguard) is what keeps me ahead on the count.</w:t>
       </w:r>
     </w:p>
     <w:p>

</xml_diff>

<commit_message>
Gaze of the Empyrean nuance: dome protects the Navigator, not strung-out Sisters
User-taught positioning rule. Gaze into the Empyrean (no enemy Reinforcements
within 12" of the Navigator) makes the NAVIGATOR un-chargeable out of Reserves
(arrival >12", charge caps at 2D6=12"). But the 12" bubble does NOT protect
loosely-placed nearby units: a Sister strung distance D toward the enemy is only
~(12-D)" from the nearest legal drop, so if D>3" an arrival lands ~9" from a
forward Sister and makes the 28% 9" charge into the Sisters -- even though it
can't touch the Navigator.

Fix folded into the sim (deployment + the dome bullet): tuck the Battle Sisters
WITHIN ~3" of the Navigator so (12-D)>9" and no clean 9" charge exists on either.
Also surfaced the Navigator's Third Eye (battle-shock 1 enemy unit within 12").
Banked in MEMORY.md.

Co-Authored-By: Claude Opus 4.8 (1M context) <noreply@anthropic.com>
</commit_message>
<xml_diff>
--- a/docs/Great-Value-vs-Knights-Full-Game-Simulation.docx
+++ b/docs/Great-Value-vs-Knights-Full-Game-Simulation.docx
@@ -1709,7 +1709,7 @@
           <w:b w:val="0"/>
           <w:i w:val="0"/>
         </w:rPr>
-        <w:t>both Castellans + the Crusader in a back-corner GUNLINE with LOS across the whole board (they never move forward). Helverins just ahead of them, also back, 36” guns covering the centre and both flanks. Battle Sisters OC10 foot half on my home B under the Navigator’s dome; Immolator + melta half central-back. Warglaive forward-right, ready to run at E and his home. Navigator by B.</w:t>
+        <w:t>both Castellans + the Crusader in a back-corner GUNLINE with LOS across the whole board (they never move forward). Helverins just ahead of them, also back, 36” guns covering the centre and both flanks. Battle Sisters OC10 foot half on my home B, TUCKED WITHIN ~3” OF THE NAVIGATOR — see the note below; if I string them out, an arrival that lands &gt;12” from the Navigator can still be 9” from a forward Sister and make the 28% charge into them. Immolator + melta half central-back. Warglaive forward-right, ready to run at E and his home. Navigator on home B.</w:t>
       </w:r>
     </w:p>
     <w:p>
@@ -2059,7 +2059,7 @@
         <w:spacing w:after="40"/>
       </w:pPr>
       <w:r>
-        <w:t>Navigator’s 12" dome: no enemy set-up within 12" (bigger than the 9" standard) — the anti-arrival linchpin over my scoring corner.</w:t>
+        <w:t>Navigator’s 12" dome (Gaze into the Empyrean): no enemy Reinforcement set-up within 12" of HIM. Since a charge caps at 2D6=12", the Navigator himself is un-chargeable out of Reserves. NUANCE (the trap): the 12" bubble protects the Navigator, NOT loosely-placed nearby units — a Sister strung &gt;3" toward the enemy is only ~9" from the nearest legal drop, so an arrival that’s &gt;12" from the Navigator can still 9"-charge the Sisters (28%). Fix: keep the Sisters WITHIN ~3" of the Navigator so (12−D)&gt;9" and no clean 9" charge exists on either. (He also has Third Eye — battle-shock one enemy unit within 12" in my Shooting phase.)</w:t>
       </w:r>
     </w:p>
     <w:p>

</xml_diff>